<commit_message>
Added Meter Testing Document and updated other docs
</commit_message>
<xml_diff>
--- a/DOCS/Aadhar.docx
+++ b/DOCS/Aadhar.docx
@@ -395,9 +395,13 @@
     </w:p>
     <w:p>
       <w:pPr>
-        <w:ind w:left="165"/>
-        <w:rPr>
-          <w:rFonts w:ascii="Calibri"/>
+        <w:widowControl/>
+        <w:autoSpaceDE/>
+        <w:autoSpaceDN/>
+        <w:rPr>
+          <w:rFonts w:ascii="Calibri" w:hAnsi="Calibri" w:cs="Calibri"/>
+          <w:color w:val="000000"/>
+          <w:lang w:val="en-IN" w:eastAsia="en-IN"/>
         </w:rPr>
       </w:pPr>
       <w:r>
@@ -451,6 +455,30 @@
           <w:spacing w:val="-10"/>
         </w:rPr>
         <w:t>-</w:t>
+      </w:r>
+      <w:r>
+        <w:rPr>
+          <w:rFonts w:ascii="Calibri"/>
+          <w:spacing w:val="-10"/>
+        </w:rPr>
+        <w:t xml:space="preserve"> ${</w:t>
+      </w:r>
+      <w:r>
+        <w:rPr>
+          <w:rFonts w:ascii="Calibri" w:hAnsi="Calibri" w:cs="Calibri"/>
+          <w:color w:val="000000"/>
+          <w:lang w:val="en-IN" w:eastAsia="en-IN"/>
+        </w:rPr>
+        <w:t>CONSUMER_NAME</w:t>
+      </w:r>
+      <w:bookmarkStart w:id="0" w:name="_GoBack"/>
+      <w:bookmarkEnd w:id="0"/>
+      <w:r>
+        <w:rPr>
+          <w:rFonts w:ascii="Calibri"/>
+          <w:spacing w:val="-10"/>
+        </w:rPr>
+        <w:t>}$</w:t>
       </w:r>
     </w:p>
     <w:p>
@@ -487,8 +515,6 @@
         </w:rPr>
         <w:t xml:space="preserve"> </w:t>
       </w:r>
-      <w:bookmarkStart w:id="0" w:name="_GoBack"/>
-      <w:bookmarkEnd w:id="0"/>
       <w:r>
         <w:rPr>
           <w:rFonts w:ascii="Calibri" w:hAnsi="Calibri"/>
@@ -708,13 +734,13 @@
               </wp:anchor>
             </w:drawing>
           </mc:Choice>
-          <mc:Fallback xmlns:w16sdtfl="http://schemas.microsoft.com/office/word/2024/wordml/sdtformatlock" xmlns:w16sdtdh="http://schemas.microsoft.com/office/word/2020/wordml/sdtdatahash" xmlns:w16du="http://schemas.microsoft.com/office/word/2023/wordml/word16du" xmlns:w16="http://schemas.microsoft.com/office/word/2018/wordml" xmlns:w16cex="http://schemas.microsoft.com/office/word/2018/wordml/cex" xmlns:oel="http://schemas.microsoft.com/office/2019/extlst">
+          <mc:Fallback>
             <w:pict>
               <v:shapetype w14:anchorId="1B649A9F" id="_x0000_t202" coordsize="21600,21600" o:spt="202" path="m,l,21600r21600,l21600,xe">
                 <v:stroke joinstyle="miter"/>
                 <v:path gradientshapeok="t" o:connecttype="rect"/>
               </v:shapetype>
-              <v:shape id="Textbox 4" o:spid="_x0000_s1026" type="#_x0000_t202" style="position:absolute;margin-left:123.75pt;margin-top:22.2pt;width:375pt;height:186.75pt;z-index:-251657216;visibility:visible;mso-wrap-style:square;mso-wrap-distance-left:0;mso-wrap-distance-top:0;mso-wrap-distance-right:0;mso-wrap-distance-bottom:0;mso-position-horizontal:absolute;mso-position-horizontal-relative:page;mso-position-vertical:absolute;mso-position-vertical-relative:text;v-text-anchor:top" o:gfxdata="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" filled="f" strokeweight=".5pt">
+              <v:shape id="Textbox 4" o:spid="_x0000_s1026" type="#_x0000_t202" style="position:absolute;margin-left:123.75pt;margin-top:22.2pt;width:375pt;height:186.75pt;z-index:-251657216;visibility:visible;mso-wrap-style:square;mso-wrap-distance-left:0;mso-wrap-distance-top:0;mso-wrap-distance-right:0;mso-wrap-distance-bottom:0;mso-position-horizontal:absolute;mso-position-horizontal-relative:page;mso-position-vertical:absolute;mso-position-vertical-relative:text;v-text-anchor:top" o:gfxdata="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" filled="f" strokeweight=".5pt">
                 <v:path arrowok="t"/>
                 <v:textbox inset="0,0,0,0">
                   <w:txbxContent>

</xml_diff>